<commit_message>
[Documentation] Update Exercise 3 team 5 submission document
</commit_message>
<xml_diff>
--- a/exer/Exercise3-team5.docx
+++ b/exer/Exercise3-team5.docx
@@ -377,40 +377,50 @@
       </w:pPr>
       <w:r>
         <w:rPr>
-          <w:rFonts w:ascii="Times New Roman" w:hAnsi="Times New Roman" w:cs="Times New Roman"/>
           <w:noProof/>
-          <w:sz w:val="40"/>
-          <w:szCs w:val="40"/>
         </w:rPr>
         <w:drawing>
-          <wp:inline distT="114300" distB="114300" distL="114300" distR="114300" wp14:anchorId="1FFC809E" wp14:editId="34DF0285">
-            <wp:extent cx="5731200" cy="4318000"/>
+          <wp:inline distT="0" distB="0" distL="0" distR="0" wp14:anchorId="13949B09" wp14:editId="5FA588B5">
+            <wp:extent cx="5733415" cy="4315460"/>
             <wp:effectExtent l="0" t="0" r="0" b="0"/>
-            <wp:docPr id="2" name="image7.png"/>
-            <wp:cNvGraphicFramePr/>
+            <wp:docPr id="464214875" name="圖片 2"/>
+            <wp:cNvGraphicFramePr>
+              <a:graphicFrameLocks xmlns:a="http://schemas.openxmlformats.org/drawingml/2006/main" noChangeAspect="1"/>
+            </wp:cNvGraphicFramePr>
             <a:graphic xmlns:a="http://schemas.openxmlformats.org/drawingml/2006/main">
               <a:graphicData uri="http://schemas.openxmlformats.org/drawingml/2006/picture">
                 <pic:pic xmlns:pic="http://schemas.openxmlformats.org/drawingml/2006/picture">
                   <pic:nvPicPr>
-                    <pic:cNvPr id="0" name="image7.png"/>
-                    <pic:cNvPicPr preferRelativeResize="0"/>
+                    <pic:cNvPr id="0" name="Picture 3"/>
+                    <pic:cNvPicPr>
+                      <a:picLocks noChangeAspect="1" noChangeArrowheads="1"/>
+                    </pic:cNvPicPr>
                   </pic:nvPicPr>
                   <pic:blipFill>
-                    <a:blip r:embed="rId7"/>
+                    <a:blip r:embed="rId7" cstate="print">
+                      <a:extLst>
+                        <a:ext uri="{28A0092B-C50C-407E-A947-70E740481C1C}">
+                          <a14:useLocalDpi xmlns:a14="http://schemas.microsoft.com/office/drawing/2010/main" val="0"/>
+                        </a:ext>
+                      </a:extLst>
+                    </a:blip>
                     <a:srcRect/>
                     <a:stretch>
                       <a:fillRect/>
                     </a:stretch>
                   </pic:blipFill>
-                  <pic:spPr>
+                  <pic:spPr bwMode="auto">
                     <a:xfrm>
                       <a:off x="0" y="0"/>
-                      <a:ext cx="5731200" cy="4318000"/>
+                      <a:ext cx="5733415" cy="4315460"/>
                     </a:xfrm>
                     <a:prstGeom prst="rect">
                       <a:avLst/>
                     </a:prstGeom>
-                    <a:ln/>
+                    <a:noFill/>
+                    <a:ln>
+                      <a:noFill/>
+                    </a:ln>
                   </pic:spPr>
                 </pic:pic>
               </a:graphicData>

</xml_diff>